<commit_message>
Conclusioni: raccomandazione piu' diretta, tolto l'UWB dagli sviluppi futuri
- "come gia' avviene nel progetto DIPME"; la raccomandazione finale
  indica cosa aggiungere al dispositivo e come tararlo
- integrazione LoRa: riformulata la frase sull'"innesto"
- sviluppi futuri: tolto il confronto a tre con l'UWB (nella tesi non
  c'e' un confronto da letteratura da portare a misura); la frase
  sull'auto-taratura ora parte dalla calibrazione del firmware V2.44
  e la estende al fondo per gate e alle soglie dell'indice

Stesse modifiche in overleaf/conclusion.tex e bozza_capitolo8.docx.

Co-Authored-By: Claude Opus 5.5 <noreply@anthropic.com>
</commit_message>
<xml_diff>
--- a/bozza_capitolo8.docx
+++ b/bozza_capitolo8.docx
@@ -21,7 +21,7 @@
         </w:rPr>
       </w:pPr>
       <w:r>
-        <w:t>La tesi ha confrontato il sensore PIR con due moduli radar mmWave a 24 GHz per il rilevamento della presenza nei nodi del progetto DIPME. Lo studio dei sensori e della loro documentazione ha chiarito il principio di funzionamento e i dati che ciascuno fornisce, dal singolo bit del PIR alla distanza e all'energia per gate del radar. Per il confronto è stata realizzata una piattaforma di acquisizione su ESP32, con un'interfaccia web servita dal nodo stesso che mostra i dati in tempo reale e li esporta in CSV.</w:t>
+        <w:t>La tesi ha confrontato il sensore PIR con due moduli radar mmWave a 24 GHz per il rilevamento della presenza di una persona, prendendo come scenario applicativo quello del progetto DIPME. Lo studio dei sensori e della loro documentazione ha chiarito il principio di funzionamento e i dati che ciascuno fornisce, dal singolo bit del PIR alla distanza e all'energia per gate del radar. Per il confronto è stata realizzata una piattaforma di acquisizione su ESP32, con un'interfaccia web servita dal nodo stesso che mostra i dati in tempo reale e li esporta in CSV.</w:t>
       </w:r>
     </w:p>
     <w:p>
@@ -43,7 +43,7 @@
         </w:rPr>
       </w:pPr>
       <w:r>
-        <w:t>Il radar consuma però circa mille volte più del PIR e, sempre acceso, esaurisce la batteria in meno di un giorno. La risposta alla domanda di partenza è quindi che il radar rileva la persona con maggiore affidabilità, ma deve affiancare il PIR, non sostituirlo. In tempo di pace il nodo resta in deep-sleep e il PIR lo sveglia quando rileva una presenza, come già avviene nel progetto [callisto2026dipme]. In emergenza si accende il radar, che rileva anche la persona ferma, e alternandolo con un ciclo di lavoro l'autonomia supera i tre giorni. La raccomandazione per il progetto è di aggiungere al nodo un modulo della classe dell'HLK-LD2410B secondo questa architettura, con una taratura all'installazione sotto l'arredo.</w:t>
+        <w:t>Il radar consuma però circa mille volte più del PIR e, sempre acceso, esaurisce la batteria in meno di un giorno. La risposta alla domanda di partenza è quindi che il radar rileva la persona con maggiore affidabilità, ma deve affiancare il PIR, non sostituirlo. In tempo di pace il nodo resta in deep-sleep e il PIR lo sveglia quando rileva una presenza, come già avviene nel progetto DIPME [callisto2026dipme]. In emergenza si accende il radar, che rileva anche la persona ferma, e alternandolo con un ciclo di lavoro l'autonomia supera i tre giorni. In concreto, al dispositivo del progetto va aggiunto un sensore radar come l'HLK-LD2410B, tarato all'installazione sotto l'arredo.</w:t>
       </w:r>
     </w:p>
     <w:p>
@@ -65,7 +65,7 @@
         </w:rPr>
       </w:pPr>
       <w:r>
-        <w:t>Restano tuttavia diverse aree da esplorare. La prima è l'integrazione con la rete LoRa. Nel regime di emergenza il bit di presenza decide la cadenza dei messaggi del nodo [callisto2026dipme], e sostituirlo con la presenza del radar è l'innesto più immediato, mentre l'indice di vitalità, che occupa un byte, renderebbe i messaggi più informativi.</w:t>
+        <w:t>Restano tuttavia diverse aree da esplorare. La prima è l'integrazione con la rete LoRa. Nel regime di emergenza il bit di presenza decide la cadenza dei messaggi del nodo [callisto2026dipme]. Il primo passo è far decidere quella cadenza al radar invece che al PIR, e aggiungere ai messaggi l'indice di vitalità, che occupa un solo byte, li renderebbe più informativi.</w:t>
       </w:r>
     </w:p>
     <w:p>
@@ -87,7 +87,7 @@
         </w:rPr>
       </w:pPr>
       <w:r>
-        <w:t>Infine, una procedura di auto-taratura all'installazione adatterebbe le soglie dell'indice a ogni banco, e un confronto a tre con il sensore UWB previsto nelle slide del progetto [slideDipme] porterebbe a una misura diretta il confronto oggi basato sulla letteratura.</w:t>
+        <w:t>Infine, il firmware dell'HLK-LD2410B tara già le proprie soglie di presenza sul rumore di fondo, su comando e con il campo libero [hilinkV244]. Una procedura analoga eseguita dal nodo all'installazione, con il banco vuoto e poi occupato, adatterebbe anche il fondo per gate e le soglie dell'indice di vitalità, che oggi dipendono dalla geometria in cui sono state tarate.</w:t>
       </w:r>
     </w:p>
     <w:p>

</xml_diff>